<commit_message>
Complete Lambda adjustments and create section 5.6: API Gateway song ngu
</commit_message>
<xml_diff>
--- a/static/images/5-Workshop/5.5-Lambda/Lambda.docx
+++ b/static/images/5-Workshop/5.5-Lambda/Lambda.docx
@@ -207,11 +207,16 @@
         </w:rPr>
         <w:t xml:space="preserve">Lambda </w:t>
       </w:r>
+      <w:proofErr w:type="gramStart"/>
       <w:r>
         <w:t>(</w:t>
       </w:r>
       <w:r>
-        <w:t xml:space="preserve"> Backend API</w:t>
+        <w:t xml:space="preserve"> Backend</w:t>
+      </w:r>
+      <w:proofErr w:type="gramEnd"/>
+      <w:r>
+        <w:t xml:space="preserve"> API</w:t>
       </w:r>
       <w:r>
         <w:t>)</w:t>
@@ -669,46 +674,6 @@
       <w:r>
         <w:tab/>
       </w:r>
-      <w:r>
-        <w:rPr>
-          <w:noProof/>
-        </w:rPr>
-        <w:drawing>
-          <wp:inline distT="0" distB="0" distL="0" distR="0" wp14:anchorId="05C9CF6B" wp14:editId="2A26F857">
-            <wp:extent cx="2743583" cy="1981477"/>
-            <wp:effectExtent l="0" t="0" r="0" b="0"/>
-            <wp:docPr id="1427689090" name="Picture 1"/>
-            <wp:cNvGraphicFramePr>
-              <a:graphicFrameLocks xmlns:a="http://schemas.openxmlformats.org/drawingml/2006/main" noChangeAspect="1"/>
-            </wp:cNvGraphicFramePr>
-            <a:graphic xmlns:a="http://schemas.openxmlformats.org/drawingml/2006/main">
-              <a:graphicData uri="http://schemas.openxmlformats.org/drawingml/2006/picture">
-                <pic:pic xmlns:pic="http://schemas.openxmlformats.org/drawingml/2006/picture">
-                  <pic:nvPicPr>
-                    <pic:cNvPr id="1427689090" name=""/>
-                    <pic:cNvPicPr/>
-                  </pic:nvPicPr>
-                  <pic:blipFill>
-                    <a:blip r:embed="rId5"/>
-                    <a:stretch>
-                      <a:fillRect/>
-                    </a:stretch>
-                  </pic:blipFill>
-                  <pic:spPr>
-                    <a:xfrm>
-                      <a:off x="0" y="0"/>
-                      <a:ext cx="2743583" cy="1981477"/>
-                    </a:xfrm>
-                    <a:prstGeom prst="rect">
-                      <a:avLst/>
-                    </a:prstGeom>
-                  </pic:spPr>
-                </pic:pic>
-              </a:graphicData>
-            </a:graphic>
-          </wp:inline>
-        </w:drawing>
-      </w:r>
     </w:p>
     <w:p>
       <w:pPr>
@@ -955,7 +920,6 @@
           <w:b/>
           <w:bCs/>
         </w:rPr>
-        <w:lastRenderedPageBreak/>
         <w:t xml:space="preserve">Các </w:t>
       </w:r>
       <w:proofErr w:type="spellStart"/>
@@ -1032,7 +996,7 @@
       <w:r>
         <w:t xml:space="preserve"> </w:t>
       </w:r>
-      <w:hyperlink r:id="rId6" w:anchor="/roles" w:history="1">
+      <w:hyperlink r:id="rId5" w:anchor="/roles" w:history="1">
         <w:r>
           <w:rPr>
             <w:rStyle w:val="Hyperlink"/>
@@ -1161,6 +1125,7 @@
         <w:rPr>
           <w:noProof/>
         </w:rPr>
+        <w:lastRenderedPageBreak/>
         <w:drawing>
           <wp:inline distT="0" distB="0" distL="0" distR="0" wp14:anchorId="1B5DD2A3" wp14:editId="58C31969">
             <wp:extent cx="5369357" cy="2438400"/>
@@ -1177,7 +1142,7 @@
                     <pic:cNvPicPr/>
                   </pic:nvPicPr>
                   <pic:blipFill>
-                    <a:blip r:embed="rId7"/>
+                    <a:blip r:embed="rId6"/>
                     <a:stretch>
                       <a:fillRect/>
                     </a:stretch>
@@ -1515,7 +1480,7 @@
                     <pic:cNvPicPr/>
                   </pic:nvPicPr>
                   <pic:blipFill>
-                    <a:blip r:embed="rId8"/>
+                    <a:blip r:embed="rId7"/>
                     <a:stretch>
                       <a:fillRect/>
                     </a:stretch>
@@ -1587,7 +1552,7 @@
                     <pic:cNvPicPr/>
                   </pic:nvPicPr>
                   <pic:blipFill>
-                    <a:blip r:embed="rId9"/>
+                    <a:blip r:embed="rId8"/>
                     <a:stretch>
                       <a:fillRect/>
                     </a:stretch>
@@ -1909,10 +1874,12 @@
         <w:t xml:space="preserve">        "</w:t>
       </w:r>
       <w:proofErr w:type="spellStart"/>
+      <w:proofErr w:type="gramStart"/>
       <w:r>
         <w:t>secretsmanager:GetSecretValue</w:t>
       </w:r>
       <w:proofErr w:type="spellEnd"/>
+      <w:proofErr w:type="gramEnd"/>
       <w:r>
         <w:t>"</w:t>
       </w:r>
@@ -1934,7 +1901,31 @@
         <w:ind w:left="1440"/>
       </w:pPr>
       <w:r>
-        <w:t xml:space="preserve">      "Resource": "arn:aws:secretsmanager:ap-southeast-1:&lt;ACCOUNT_ID&gt;:secret:/examora/dev/mongodb-*"</w:t>
+        <w:t xml:space="preserve">      "Resource": "</w:t>
+      </w:r>
+      <w:proofErr w:type="gramStart"/>
+      <w:r>
+        <w:t>arn:aws</w:t>
+      </w:r>
+      <w:proofErr w:type="gramEnd"/>
+      <w:r>
+        <w:t>:</w:t>
+      </w:r>
+      <w:proofErr w:type="gramStart"/>
+      <w:r>
+        <w:t>secretsmanager:ap</w:t>
+      </w:r>
+      <w:proofErr w:type="gramEnd"/>
+      <w:r>
+        <w:t>-southeast-1:&lt;ACCOUNT_ID</w:t>
+      </w:r>
+      <w:proofErr w:type="gramStart"/>
+      <w:r>
+        <w:t>&gt;:secret:/examora/dev/mongodb-</w:t>
+      </w:r>
+      <w:proofErr w:type="gramEnd"/>
+      <w:r>
+        <w:t>*"</w:t>
       </w:r>
     </w:p>
     <w:p>
@@ -2190,7 +2181,7 @@
                     <pic:cNvPicPr/>
                   </pic:nvPicPr>
                   <pic:blipFill>
-                    <a:blip r:embed="rId10"/>
+                    <a:blip r:embed="rId9"/>
                     <a:stretch>
                       <a:fillRect/>
                     </a:stretch>
@@ -2473,7 +2464,7 @@
       <w:r>
         <w:t xml:space="preserve"> </w:t>
       </w:r>
-      <w:hyperlink r:id="rId11" w:anchor="/discover" w:history="1">
+      <w:hyperlink r:id="rId10" w:anchor="/discover" w:history="1">
         <w:r>
           <w:rPr>
             <w:rStyle w:val="Hyperlink"/>
@@ -2666,7 +2657,7 @@
                     <pic:cNvPicPr/>
                   </pic:nvPicPr>
                   <pic:blipFill>
-                    <a:blip r:embed="rId12"/>
+                    <a:blip r:embed="rId11"/>
                     <a:stretch>
                       <a:fillRect/>
                     </a:stretch>
@@ -2733,7 +2724,7 @@
                     <pic:cNvPicPr/>
                   </pic:nvPicPr>
                   <pic:blipFill>
-                    <a:blip r:embed="rId13"/>
+                    <a:blip r:embed="rId12"/>
                     <a:stretch>
                       <a:fillRect/>
                     </a:stretch>
@@ -2949,7 +2940,7 @@
                     <pic:cNvPicPr/>
                   </pic:nvPicPr>
                   <pic:blipFill>
-                    <a:blip r:embed="rId14"/>
+                    <a:blip r:embed="rId13"/>
                     <a:stretch>
                       <a:fillRect/>
                     </a:stretch>
@@ -3515,7 +3506,7 @@
                     <pic:cNvPicPr/>
                   </pic:nvPicPr>
                   <pic:blipFill>
-                    <a:blip r:embed="rId15"/>
+                    <a:blip r:embed="rId14"/>
                     <a:stretch>
                       <a:fillRect/>
                     </a:stretch>
@@ -4017,7 +4008,7 @@
                     <pic:cNvPicPr/>
                   </pic:nvPicPr>
                   <pic:blipFill>
-                    <a:blip r:embed="rId16"/>
+                    <a:blip r:embed="rId15"/>
                     <a:stretch>
                       <a:fillRect/>
                     </a:stretch>
@@ -4079,14 +4070,14 @@
         <w:rPr>
           <w:rFonts w:eastAsia="Times New Roman"/>
         </w:rPr>
-        <w:t xml:space="preserve"> c</w:t>
+        <w:t xml:space="preserve"> </w:t>
       </w:r>
       <w:proofErr w:type="spellStart"/>
       <w:r>
         <w:rPr>
           <w:rFonts w:eastAsia="Times New Roman"/>
         </w:rPr>
-        <w:t>hỉnh</w:t>
+        <w:t>chỉnh</w:t>
       </w:r>
       <w:proofErr w:type="spellEnd"/>
       <w:r>
@@ -4220,10 +4211,12 @@
         <w:t xml:space="preserve">Express app → </w:t>
       </w:r>
       <w:proofErr w:type="spellStart"/>
+      <w:proofErr w:type="gramStart"/>
       <w:r>
         <w:t>server.listen</w:t>
       </w:r>
       <w:proofErr w:type="spellEnd"/>
+      <w:proofErr w:type="gramEnd"/>
       <w:r>
         <w:t>(PORT)</w:t>
       </w:r>
@@ -4682,8 +4675,9 @@
           <w:szCs w:val="20"/>
           <w14:ligatures w14:val="none"/>
         </w:rPr>
-        <w:t>API Gateway event</w:t>
-      </w:r>
+        <w:t xml:space="preserve">API Gateway </w:t>
+      </w:r>
+      <w:proofErr w:type="gramStart"/>
       <w:r>
         <w:rPr>
           <w:rFonts w:eastAsia="Times New Roman" w:cs="Times New Roman"/>
@@ -4692,7 +4686,7 @@
           <w:szCs w:val="20"/>
           <w14:ligatures w14:val="none"/>
         </w:rPr>
-        <w:t xml:space="preserve">  </w:t>
+        <w:t>event</w:t>
       </w:r>
       <w:r>
         <w:rPr>
@@ -4702,7 +4696,7 @@
           <w:szCs w:val="20"/>
           <w14:ligatures w14:val="none"/>
         </w:rPr>
-        <w:t>→ Lambda handler</w:t>
+        <w:t xml:space="preserve">  </w:t>
       </w:r>
       <w:r>
         <w:rPr>
@@ -4712,8 +4706,9 @@
           <w:szCs w:val="20"/>
           <w14:ligatures w14:val="none"/>
         </w:rPr>
-        <w:t xml:space="preserve">  </w:t>
-      </w:r>
+        <w:t>→</w:t>
+      </w:r>
+      <w:proofErr w:type="gramEnd"/>
       <w:r>
         <w:rPr>
           <w:rFonts w:eastAsia="Times New Roman" w:cs="Times New Roman"/>
@@ -4722,8 +4717,9 @@
           <w:szCs w:val="20"/>
           <w14:ligatures w14:val="none"/>
         </w:rPr>
-        <w:t>→ Express app</w:t>
-      </w:r>
+        <w:t xml:space="preserve"> Lambda </w:t>
+      </w:r>
+      <w:proofErr w:type="gramStart"/>
       <w:r>
         <w:rPr>
           <w:rFonts w:eastAsia="Times New Roman" w:cs="Times New Roman"/>
@@ -4732,7 +4728,7 @@
           <w:szCs w:val="20"/>
           <w14:ligatures w14:val="none"/>
         </w:rPr>
-        <w:t xml:space="preserve"> </w:t>
+        <w:t>handler</w:t>
       </w:r>
       <w:r>
         <w:rPr>
@@ -4742,7 +4738,7 @@
           <w:szCs w:val="20"/>
           <w14:ligatures w14:val="none"/>
         </w:rPr>
-        <w:t>→ Middleware verify Cognito JWT</w:t>
+        <w:t xml:space="preserve">  </w:t>
       </w:r>
       <w:r>
         <w:rPr>
@@ -4752,9 +4748,9 @@
           <w:szCs w:val="20"/>
           <w14:ligatures w14:val="none"/>
         </w:rPr>
-        <w:br/>
-        <w:t>→ Connect MongoDB Atlas</w:t>
-      </w:r>
+        <w:t>→</w:t>
+      </w:r>
+      <w:proofErr w:type="gramEnd"/>
       <w:r>
         <w:rPr>
           <w:rFonts w:eastAsia="Times New Roman" w:cs="Times New Roman"/>
@@ -4763,7 +4759,7 @@
           <w:szCs w:val="20"/>
           <w14:ligatures w14:val="none"/>
         </w:rPr>
-        <w:t xml:space="preserve"> </w:t>
+        <w:t xml:space="preserve"> Express app</w:t>
       </w:r>
       <w:r>
         <w:rPr>
@@ -4773,9 +4769,8 @@
           <w:szCs w:val="20"/>
           <w14:ligatures w14:val="none"/>
         </w:rPr>
-        <w:t xml:space="preserve">→ </w:t>
-      </w:r>
-      <w:proofErr w:type="spellStart"/>
+        <w:t xml:space="preserve"> </w:t>
+      </w:r>
       <w:r>
         <w:rPr>
           <w:rFonts w:eastAsia="Times New Roman" w:cs="Times New Roman"/>
@@ -4784,9 +4779,8 @@
           <w:szCs w:val="20"/>
           <w14:ligatures w14:val="none"/>
         </w:rPr>
-        <w:t>Xử</w:t>
-      </w:r>
-      <w:proofErr w:type="spellEnd"/>
+        <w:t>→ Middleware verify Cognito JWT</w:t>
+      </w:r>
       <w:r>
         <w:rPr>
           <w:rFonts w:eastAsia="Times New Roman" w:cs="Times New Roman"/>
@@ -4795,9 +4789,9 @@
           <w:szCs w:val="20"/>
           <w14:ligatures w14:val="none"/>
         </w:rPr>
-        <w:t xml:space="preserve"> </w:t>
-      </w:r>
-      <w:proofErr w:type="spellStart"/>
+        <w:br/>
+        <w:t>→ Connect MongoDB Atlas</w:t>
+      </w:r>
       <w:r>
         <w:rPr>
           <w:rFonts w:eastAsia="Times New Roman" w:cs="Times New Roman"/>
@@ -4806,9 +4800,8 @@
           <w:szCs w:val="20"/>
           <w14:ligatures w14:val="none"/>
         </w:rPr>
-        <w:t>lý</w:t>
-      </w:r>
-      <w:proofErr w:type="spellEnd"/>
+        <w:t xml:space="preserve"> </w:t>
+      </w:r>
       <w:r>
         <w:rPr>
           <w:rFonts w:eastAsia="Times New Roman" w:cs="Times New Roman"/>
@@ -4817,8 +4810,9 @@
           <w:szCs w:val="20"/>
           <w14:ligatures w14:val="none"/>
         </w:rPr>
-        <w:t xml:space="preserve"> API</w:t>
-      </w:r>
+        <w:t xml:space="preserve">→ </w:t>
+      </w:r>
+      <w:proofErr w:type="spellStart"/>
       <w:r>
         <w:rPr>
           <w:rFonts w:eastAsia="Times New Roman" w:cs="Times New Roman"/>
@@ -4827,8 +4821,9 @@
           <w:szCs w:val="20"/>
           <w14:ligatures w14:val="none"/>
         </w:rPr>
-        <w:t xml:space="preserve">  </w:t>
-      </w:r>
+        <w:t>Xử</w:t>
+      </w:r>
+      <w:proofErr w:type="spellEnd"/>
       <w:r>
         <w:rPr>
           <w:rFonts w:eastAsia="Times New Roman" w:cs="Times New Roman"/>
@@ -4837,7 +4832,7 @@
           <w:szCs w:val="20"/>
           <w14:ligatures w14:val="none"/>
         </w:rPr>
-        <w:t xml:space="preserve">→ </w:t>
+        <w:t xml:space="preserve"> </w:t>
       </w:r>
       <w:proofErr w:type="spellStart"/>
       <w:r>
@@ -4848,7 +4843,7 @@
           <w:szCs w:val="20"/>
           <w14:ligatures w14:val="none"/>
         </w:rPr>
-        <w:t>Trả</w:t>
+        <w:t>lý</w:t>
       </w:r>
       <w:proofErr w:type="spellEnd"/>
       <w:r>
@@ -4859,6 +4854,70 @@
           <w:szCs w:val="20"/>
           <w14:ligatures w14:val="none"/>
         </w:rPr>
+        <w:t xml:space="preserve"> </w:t>
+      </w:r>
+      <w:proofErr w:type="gramStart"/>
+      <w:r>
+        <w:rPr>
+          <w:rFonts w:eastAsia="Times New Roman" w:cs="Times New Roman"/>
+          <w:kern w:val="0"/>
+          <w:sz w:val="20"/>
+          <w:szCs w:val="20"/>
+          <w14:ligatures w14:val="none"/>
+        </w:rPr>
+        <w:t>API</w:t>
+      </w:r>
+      <w:r>
+        <w:rPr>
+          <w:rFonts w:eastAsia="Times New Roman" w:cs="Times New Roman"/>
+          <w:kern w:val="0"/>
+          <w:sz w:val="20"/>
+          <w:szCs w:val="20"/>
+          <w14:ligatures w14:val="none"/>
+        </w:rPr>
+        <w:t xml:space="preserve">  </w:t>
+      </w:r>
+      <w:r>
+        <w:rPr>
+          <w:rFonts w:eastAsia="Times New Roman" w:cs="Times New Roman"/>
+          <w:kern w:val="0"/>
+          <w:sz w:val="20"/>
+          <w:szCs w:val="20"/>
+          <w14:ligatures w14:val="none"/>
+        </w:rPr>
+        <w:t>→</w:t>
+      </w:r>
+      <w:proofErr w:type="gramEnd"/>
+      <w:r>
+        <w:rPr>
+          <w:rFonts w:eastAsia="Times New Roman" w:cs="Times New Roman"/>
+          <w:kern w:val="0"/>
+          <w:sz w:val="20"/>
+          <w:szCs w:val="20"/>
+          <w14:ligatures w14:val="none"/>
+        </w:rPr>
+        <w:t xml:space="preserve"> </w:t>
+      </w:r>
+      <w:proofErr w:type="spellStart"/>
+      <w:r>
+        <w:rPr>
+          <w:rFonts w:eastAsia="Times New Roman" w:cs="Times New Roman"/>
+          <w:kern w:val="0"/>
+          <w:sz w:val="20"/>
+          <w:szCs w:val="20"/>
+          <w14:ligatures w14:val="none"/>
+        </w:rPr>
+        <w:t>Trả</w:t>
+      </w:r>
+      <w:proofErr w:type="spellEnd"/>
+      <w:r>
+        <w:rPr>
+          <w:rFonts w:eastAsia="Times New Roman" w:cs="Times New Roman"/>
+          <w:kern w:val="0"/>
+          <w:sz w:val="20"/>
+          <w:szCs w:val="20"/>
+          <w14:ligatures w14:val="none"/>
+        </w:rPr>
         <w:t xml:space="preserve"> response</w:t>
       </w:r>
     </w:p>
@@ -5010,11 +5069,11 @@
       </w:r>
       <w:proofErr w:type="spellEnd"/>
       <w:r>
-        <w:t xml:space="preserve"> g</w:t>
-      </w:r>
-      <w:proofErr w:type="spellStart"/>
-      <w:r>
-        <w:t>ói</w:t>
+        <w:t xml:space="preserve"> </w:t>
+      </w:r>
+      <w:proofErr w:type="spellStart"/>
+      <w:r>
+        <w:t>gói</w:t>
       </w:r>
       <w:proofErr w:type="spellEnd"/>
       <w:r>
@@ -5081,19 +5140,23 @@
         <w:br/>
       </w:r>
       <w:proofErr w:type="spellStart"/>
+      <w:proofErr w:type="gramStart"/>
       <w:r>
         <w:t>package.json</w:t>
       </w:r>
       <w:proofErr w:type="spellEnd"/>
+      <w:proofErr w:type="gramEnd"/>
       <w:r>
         <w:br/>
         <w:t>package-</w:t>
       </w:r>
       <w:proofErr w:type="spellStart"/>
+      <w:proofErr w:type="gramStart"/>
       <w:r>
         <w:t>lock.json</w:t>
       </w:r>
       <w:proofErr w:type="spellEnd"/>
+      <w:proofErr w:type="gramEnd"/>
     </w:p>
     <w:p>
       <w:pPr>
@@ -5145,7 +5208,7 @@
       <w:r>
         <w:t xml:space="preserve"> </w:t>
       </w:r>
-      <w:hyperlink r:id="rId17" w:anchor="/functions" w:history="1">
+      <w:hyperlink r:id="rId16" w:anchor="/functions" w:history="1">
         <w:r>
           <w:rPr>
             <w:rStyle w:val="Hyperlink"/>
@@ -5308,6 +5371,9 @@
         <w:ind w:hanging="1004"/>
       </w:pPr>
       <w:r>
+        <w:rPr>
+          <w:noProof/>
+        </w:rPr>
         <w:drawing>
           <wp:inline distT="0" distB="0" distL="0" distR="0" wp14:anchorId="610CDB2C" wp14:editId="08192145">
             <wp:extent cx="5940425" cy="3074035"/>
@@ -5324,7 +5390,7 @@
                     <pic:cNvPicPr/>
                   </pic:nvPicPr>
                   <pic:blipFill>
-                    <a:blip r:embed="rId18"/>
+                    <a:blip r:embed="rId17"/>
                     <a:stretch>
                       <a:fillRect/>
                     </a:stretch>
@@ -5527,6 +5593,9 @@
         <w:ind w:left="1080" w:hanging="938"/>
       </w:pPr>
       <w:r>
+        <w:rPr>
+          <w:noProof/>
+        </w:rPr>
         <w:drawing>
           <wp:inline distT="0" distB="0" distL="0" distR="0" wp14:anchorId="7161EC4E" wp14:editId="42F99047">
             <wp:extent cx="5940425" cy="2228215"/>
@@ -5543,7 +5612,7 @@
                     <pic:cNvPicPr/>
                   </pic:nvPicPr>
                   <pic:blipFill>
-                    <a:blip r:embed="rId19"/>
+                    <a:blip r:embed="rId18"/>
                     <a:stretch>
                       <a:fillRect/>
                     </a:stretch>
@@ -5693,13 +5762,18 @@
       </w:r>
       <w:proofErr w:type="spellEnd"/>
       <w:r>
-        <w:t xml:space="preserve"> Test ( </w:t>
+        <w:t xml:space="preserve"> Test </w:t>
+      </w:r>
+      <w:proofErr w:type="gramStart"/>
+      <w:r>
+        <w:t xml:space="preserve">( </w:t>
       </w:r>
       <w:proofErr w:type="spellStart"/>
       <w:r>
         <w:t>hoặc</w:t>
       </w:r>
       <w:proofErr w:type="spellEnd"/>
+      <w:proofErr w:type="gramEnd"/>
       <w:r>
         <w:t xml:space="preserve"> Ctrl + Shift + I) </w:t>
       </w:r>
@@ -5887,7 +5961,15 @@
         <w:jc w:val="center"/>
       </w:pPr>
       <w:r>
-        <w:t>"user-agent": "lambda-test"</w:t>
+        <w:t>"</w:t>
+      </w:r>
+      <w:proofErr w:type="gramStart"/>
+      <w:r>
+        <w:t>user</w:t>
+      </w:r>
+      <w:proofErr w:type="gramEnd"/>
+      <w:r>
+        <w:t>-agent": "lambda-test"</w:t>
       </w:r>
     </w:p>
     <w:p>
@@ -5992,6 +6074,9 @@
         <w:spacing w:line="360" w:lineRule="auto"/>
       </w:pPr>
       <w:r>
+        <w:rPr>
+          <w:noProof/>
+        </w:rPr>
         <w:drawing>
           <wp:inline distT="0" distB="0" distL="0" distR="0" wp14:anchorId="0013C7EF" wp14:editId="11E9C27E">
             <wp:extent cx="5329451" cy="2755900"/>
@@ -6008,7 +6093,7 @@
                     <pic:cNvPicPr/>
                   </pic:nvPicPr>
                   <pic:blipFill>
-                    <a:blip r:embed="rId20"/>
+                    <a:blip r:embed="rId19"/>
                     <a:stretch>
                       <a:fillRect/>
                     </a:stretch>
@@ -6182,6 +6267,9 @@
         <w:ind w:left="720"/>
       </w:pPr>
       <w:r>
+        <w:rPr>
+          <w:noProof/>
+        </w:rPr>
         <w:drawing>
           <wp:inline distT="0" distB="0" distL="0" distR="0" wp14:anchorId="26F4D3F9" wp14:editId="2D02EAA5">
             <wp:extent cx="5438633" cy="2256790"/>
@@ -6198,7 +6286,7 @@
                     <pic:cNvPicPr/>
                   </pic:nvPicPr>
                   <pic:blipFill>
-                    <a:blip r:embed="rId21"/>
+                    <a:blip r:embed="rId20"/>
                     <a:stretch>
                       <a:fillRect/>
                     </a:stretch>
@@ -6289,7 +6377,7 @@
       <w:r>
         <w:t xml:space="preserve"> </w:t>
       </w:r>
-      <w:hyperlink r:id="rId22" w:anchor="logsV2:log-groups" w:history="1">
+      <w:hyperlink r:id="rId21" w:anchor="logsV2:log-groups" w:history="1">
         <w:r>
           <w:rPr>
             <w:rStyle w:val="Hyperlink"/>
@@ -6415,6 +6503,9 @@
         <w:ind w:left="1440" w:hanging="873"/>
       </w:pPr>
       <w:r>
+        <w:rPr>
+          <w:noProof/>
+        </w:rPr>
         <w:drawing>
           <wp:inline distT="0" distB="0" distL="0" distR="0" wp14:anchorId="11B6BA66" wp14:editId="6B56DA5F">
             <wp:extent cx="5940425" cy="1832610"/>
@@ -6431,7 +6522,7 @@
                     <pic:cNvPicPr/>
                   </pic:nvPicPr>
                   <pic:blipFill>
-                    <a:blip r:embed="rId23"/>
+                    <a:blip r:embed="rId22"/>
                     <a:stretch>
                       <a:fillRect/>
                     </a:stretch>
@@ -6450,6 +6541,28 @@
             </a:graphic>
           </wp:inline>
         </w:drawing>
+      </w:r>
+    </w:p>
+    <w:p>
+      <w:pPr>
+        <w:pStyle w:val="ListParagraph"/>
+        <w:spacing w:line="360" w:lineRule="auto"/>
+        <w:ind w:left="1440" w:hanging="873"/>
+      </w:pPr>
+      <w:r>
+        <w:tab/>
+      </w:r>
+      <w:r>
+        <w:tab/>
+      </w:r>
+      <w:r>
+        <w:tab/>
+      </w:r>
+      <w:r>
+        <w:tab/>
+      </w:r>
+      <w:r>
+        <w:t>CloudWatchLog.png</w:t>
       </w:r>
     </w:p>
     <w:p>
@@ -9820,6 +9933,7 @@
   <w:style w:type="character" w:default="1" w:styleId="DefaultParagraphFont">
     <w:name w:val="Default Paragraph Font"/>
     <w:uiPriority w:val="1"/>
+    <w:semiHidden/>
     <w:unhideWhenUsed/>
   </w:style>
   <w:style w:type="table" w:default="1" w:styleId="TableNormal">

</xml_diff>